<commit_message>
Remove platform coupling from the scorecard and the schedule
Table 5 is back to six risks and Figure 2 to eight workstreams.

Two week entries went with it, both of which named the removed concept:
Week 14's "report the coupling measurement", which after the removal
reported into nothing, and the words "instrument the coupling" from Week
2's job title. Week 2 keeps the instrumentation task itself, since
recording each customer's acquisition source is worth having whether or
not it is a tracked risk.

Figure 2's row height drops from 25 units to 19. At 25 the shorter figure
opened its own page and stranded the working note on a sixth; at 19 it
lands at the foot of page 5 with the note under it. Five pages now, PDF
and Word still beginning every page at the same point.

Co-Authored-By: Claude Opus 5 <noreply@anthropic.com>
Claude-Session: https://claude.ai/code/session_01HAZLkLE85rjRAgcZW1sudJ
</commit_message>
<xml_diff>
--- a/docs/crp/Olera_Pre_CRP_RD_Commercialization_and_Execution_Plan.docx
+++ b/docs/crp/Olera_Pre_CRP_RD_Commercialization_and_Execution_Plan.docx
@@ -2696,127 +2696,6 @@
                 <w:color w:val="14453F"/>
                 <w:sz w:val="18"/>
               </w:rPr>
-              <w:t>Platform coupling</w:t>
-            </w:r>
-          </w:p>
-        </w:tc>
-        <w:tc>
-          <w:tcPr>
-            <w:tcW w:type="dxa" w:w="2052"/>
-            <w:tcBorders>
-              <w:bottom w:val="single" w:sz="2" w:space="0" w:color="B9C4BD"/>
-            </w:tcBorders>
-          </w:tcPr>
-          <w:p>
-            <w:pPr>
-              <w:spacing w:before="56" w:after="56" w:lineRule="exact" w:line="209"/>
-              <w:jc w:val="left"/>
-            </w:pPr>
-            <w:r/>
-            <w:r>
-              <w:rPr>
-                <w:b w:val="0"/>
-                <w:i w:val="0"/>
-                <w:sz w:val="18"/>
-              </w:rPr>
-              <w:t>The strongest objection is that the provider products could be sold without the navigation platform, making the free marketplace look like a mission expense rather than the engine of provider value.</w:t>
-            </w:r>
-          </w:p>
-        </w:tc>
-        <w:tc>
-          <w:tcPr>
-            <w:tcW w:type="dxa" w:w="2484"/>
-            <w:tcBorders>
-              <w:bottom w:val="single" w:sz="2" w:space="0" w:color="B9C4BD"/>
-            </w:tcBorders>
-          </w:tcPr>
-          <w:p>
-            <w:pPr>
-              <w:spacing w:before="56" w:after="56" w:lineRule="exact" w:line="209"/>
-              <w:jc w:val="left"/>
-            </w:pPr>
-            <w:r/>
-            <w:r>
-              <w:rPr>
-                <w:b w:val="0"/>
-                <w:i w:val="0"/>
-                <w:sz w:val="18"/>
-              </w:rPr>
-              <w:t>Provider acquisition instrumented from Week 2: the share of paying providers reached through claimed listings or family demand, and their stated reasons for buying.</w:t>
-            </w:r>
-          </w:p>
-        </w:tc>
-        <w:tc>
-          <w:tcPr>
-            <w:tcW w:type="dxa" w:w="1944"/>
-            <w:tcBorders>
-              <w:bottom w:val="single" w:sz="2" w:space="0" w:color="B9C4BD"/>
-            </w:tcBorders>
-          </w:tcPr>
-          <w:p>
-            <w:pPr>
-              <w:spacing w:before="56" w:after="56" w:lineRule="exact" w:line="209"/>
-              <w:jc w:val="left"/>
-            </w:pPr>
-            <w:r/>
-            <w:r>
-              <w:rPr>
-                <w:b w:val="0"/>
-                <w:i w:val="0"/>
-                <w:sz w:val="18"/>
-              </w:rPr>
-              <w:t>A measured difference in conversion or retention between providers exposed to family demand and those not.</w:t>
-            </w:r>
-          </w:p>
-        </w:tc>
-        <w:tc>
-          <w:tcPr>
-            <w:tcW w:type="dxa" w:w="2700"/>
-            <w:tcBorders>
-              <w:bottom w:val="single" w:sz="2" w:space="0" w:color="B9C4BD"/>
-            </w:tcBorders>
-          </w:tcPr>
-          <w:p>
-            <w:pPr>
-              <w:spacing w:before="56" w:after="56" w:lineRule="exact" w:line="209"/>
-              <w:jc w:val="left"/>
-            </w:pPr>
-            <w:r/>
-            <w:r>
-              <w:rPr>
-                <w:b w:val="0"/>
-                <w:i w:val="0"/>
-                <w:sz w:val="18"/>
-              </w:rPr>
-              <w:t>Provider revenue is generated by the free navigation layer rather than alongside it, and Olera has measured the link.</w:t>
-            </w:r>
-          </w:p>
-        </w:tc>
-      </w:tr>
-      <w:tr>
-        <w:trPr>
-          <w:cantSplit w:val="true"/>
-        </w:trPr>
-        <w:tc>
-          <w:tcPr>
-            <w:tcW w:type="dxa" w:w="1620"/>
-            <w:tcBorders>
-              <w:bottom w:val="single" w:sz="2" w:space="0" w:color="B9C4BD"/>
-            </w:tcBorders>
-          </w:tcPr>
-          <w:p>
-            <w:pPr>
-              <w:spacing w:before="56" w:after="56" w:lineRule="exact" w:line="209"/>
-              <w:jc w:val="left"/>
-            </w:pPr>
-            <w:r/>
-            <w:r>
-              <w:rPr>
-                <w:b/>
-                <w:i w:val="0"/>
-                <w:color w:val="14453F"/>
-                <w:sz w:val="18"/>
-              </w:rPr>
               <w:t>CareNavigator product</w:t>
             </w:r>
           </w:p>
@@ -3630,7 +3509,7 @@
                 <w:i w:val="0"/>
                 <w:sz w:val="18"/>
               </w:rPr>
-              <w:t>Package the offers; instrument the coupling</w:t>
+              <w:t>Package the offers</w:t>
             </w:r>
           </w:p>
         </w:tc>
@@ -4829,7 +4708,7 @@
                 <w:i w:val="0"/>
                 <w:sz w:val="18"/>
               </w:rPr>
-              <w:t>Show retention/repeat purchase; consolidate CareNavigator V&amp;V data and the care-establishment count; report the coupling measurement; update economics and buyer evidence.</w:t>
+              <w:t>Show retention/repeat purchase; consolidate CareNavigator V&amp;V data and the care-establishment count; update economics and buyer evidence.</w:t>
             </w:r>
           </w:p>
         </w:tc>
@@ -5258,7 +5137,7 @@
       <w:r>
         <w:drawing>
           <wp:inline xmlns:a="http://schemas.openxmlformats.org/drawingml/2006/main" xmlns:pic="http://schemas.openxmlformats.org/drawingml/2006/picture">
-            <wp:extent cx="6675120" cy="3121349"/>
+            <wp:extent cx="6675120" cy="2308276"/>
             <wp:docPr id="2" name="Picture 2"/>
             <wp:cNvGraphicFramePr>
               <a:graphicFrameLocks noChangeAspect="1"/>
@@ -5279,7 +5158,7 @@
                   <pic:spPr>
                     <a:xfrm>
                       <a:off x="0" y="0"/>
-                      <a:ext cx="6675120" cy="3121349"/>
+                      <a:ext cx="6675120" cy="2308276"/>
                     </a:xfrm>
                     <a:prstGeom prst="rect"/>
                   </pic:spPr>
@@ -5309,7 +5188,7 @@
           <w:i w:val="0"/>
           <w:sz w:val="18"/>
         </w:rPr>
-        <w:t xml:space="preserve"> The same eighteen weeks as a schedule, so the overlaps are visible. Selling, the CareNavigator build, and buyer discovery all run through the autumn; the letter of intent and the financing test start once there is something to show and have to close before the evidence freezes in Week 15.</w:t>
+        <w:t xml:space="preserve"> The same eighteen weeks as a schedule, so the overlaps are visible. The letter of intent and the financing test start once there is something to show, and both have to close before the evidence freezes in Week 15.</w:t>
       </w:r>
     </w:p>
     <w:p>

</xml_diff>

<commit_message>
Set the week plan's tasks as bullets
The source writes each week's tasks as one semicolon-separated sentence.
They are now one bullet per clause, same words in the same order, with a
hanging indent per item so a wrapped task lines up under its own text
rather than under the bullet. The other tables keep their semicolon
lists, which are prose rather than task lists.

The Word cell splitter now recognises the bulleted items as well as
<br>, and gives each a teal bullet run and a matching hanging indent.

Six pages. The taller week table pushes the last row and the schedule
onto page 6, which gave Figure 2 room to go back to 25-unit rows. PDF and
Word still begin every page at the same point.

Co-Authored-By: Claude Opus 5 <noreply@anthropic.com>
Claude-Session: https://claude.ai/code/session_01HAZLkLE85rjRAgcZW1sudJ
</commit_message>
<xml_diff>
--- a/docs/crp/Olera_Pre_CRP_RD_Commercialization_and_Execution_Plan.docx
+++ b/docs/crp/Olera_Pre_CRP_RD_Commercialization_and_Execution_Plan.docx
@@ -3424,17 +3424,91 @@
           </w:tcPr>
           <w:p>
             <w:pPr>
-              <w:spacing w:before="56" w:after="56" w:lineRule="exact" w:line="209"/>
+              <w:spacing w:before="56" w:after="30" w:lineRule="exact" w:line="209"/>
+              <w:ind w:left="140" w:hanging="140"/>
               <w:jc w:val="left"/>
             </w:pPr>
             <w:r/>
+            <w:r>
+              <w:rPr>
+                <w:color w:val="14453F"/>
+                <w:sz w:val="18"/>
+              </w:rPr>
+              <w:t xml:space="preserve">• </w:t>
+            </w:r>
             <w:r>
               <w:rPr>
                 <w:b w:val="0"/>
                 <w:i w:val="0"/>
                 <w:sz w:val="18"/>
               </w:rPr>
-              <w:t>Lock target/stretch goals; choose beachhead emphasis; record baseline provider, product, buyer, and CareNavigator metrics; stand up weekly dashboard.</w:t>
+              <w:t>Lock target/stretch goals</w:t>
+            </w:r>
+          </w:p>
+          <w:p>
+            <w:pPr>
+              <w:spacing w:before="0" w:after="30" w:lineRule="exact" w:line="209"/>
+              <w:ind w:left="140" w:hanging="140"/>
+              <w:jc w:val="left"/>
+            </w:pPr>
+            <w:r>
+              <w:rPr>
+                <w:color w:val="14453F"/>
+                <w:sz w:val="18"/>
+              </w:rPr>
+              <w:t xml:space="preserve">• </w:t>
+            </w:r>
+            <w:r>
+              <w:rPr>
+                <w:b w:val="0"/>
+                <w:i w:val="0"/>
+                <w:sz w:val="18"/>
+              </w:rPr>
+              <w:t>Choose beachhead emphasis</w:t>
+            </w:r>
+          </w:p>
+          <w:p>
+            <w:pPr>
+              <w:spacing w:before="0" w:after="30" w:lineRule="exact" w:line="209"/>
+              <w:ind w:left="140" w:hanging="140"/>
+              <w:jc w:val="left"/>
+            </w:pPr>
+            <w:r>
+              <w:rPr>
+                <w:color w:val="14453F"/>
+                <w:sz w:val="18"/>
+              </w:rPr>
+              <w:t xml:space="preserve">• </w:t>
+            </w:r>
+            <w:r>
+              <w:rPr>
+                <w:b w:val="0"/>
+                <w:i w:val="0"/>
+                <w:sz w:val="18"/>
+              </w:rPr>
+              <w:t>Record baseline provider, product, buyer, and CareNavigator metrics</w:t>
+            </w:r>
+          </w:p>
+          <w:p>
+            <w:pPr>
+              <w:spacing w:before="0" w:after="30" w:lineRule="exact" w:line="209"/>
+              <w:ind w:left="140" w:hanging="140"/>
+              <w:jc w:val="left"/>
+            </w:pPr>
+            <w:r>
+              <w:rPr>
+                <w:color w:val="14453F"/>
+                <w:sz w:val="18"/>
+              </w:rPr>
+              <w:t xml:space="preserve">• </w:t>
+            </w:r>
+            <w:r>
+              <w:rPr>
+                <w:b w:val="0"/>
+                <w:i w:val="0"/>
+                <w:sz w:val="18"/>
+              </w:rPr>
+              <w:t>Stand up weekly dashboard</w:t>
             </w:r>
           </w:p>
         </w:tc>
@@ -3522,17 +3596,69 @@
           </w:tcPr>
           <w:p>
             <w:pPr>
-              <w:spacing w:before="56" w:after="56" w:lineRule="exact" w:line="209"/>
+              <w:spacing w:before="56" w:after="30" w:lineRule="exact" w:line="209"/>
+              <w:ind w:left="140" w:hanging="140"/>
               <w:jc w:val="left"/>
             </w:pPr>
             <w:r/>
+            <w:r>
+              <w:rPr>
+                <w:color w:val="14453F"/>
+                <w:sz w:val="18"/>
+              </w:rPr>
+              <w:t xml:space="preserve">• </w:t>
+            </w:r>
             <w:r>
               <w:rPr>
                 <w:b w:val="0"/>
                 <w:i w:val="0"/>
                 <w:sz w:val="18"/>
               </w:rPr>
-              <w:t>Finalize Client Growth and Staffing offers, pricing, terms, delivery workflow, and target agency list; define what will be measured; instrument provider acquisition so every paying provider records how it reached Olera.</w:t>
+              <w:t>Finalize Client Growth and Staffing offers, pricing, terms, delivery workflow, and target agency list</w:t>
+            </w:r>
+          </w:p>
+          <w:p>
+            <w:pPr>
+              <w:spacing w:before="0" w:after="30" w:lineRule="exact" w:line="209"/>
+              <w:ind w:left="140" w:hanging="140"/>
+              <w:jc w:val="left"/>
+            </w:pPr>
+            <w:r>
+              <w:rPr>
+                <w:color w:val="14453F"/>
+                <w:sz w:val="18"/>
+              </w:rPr>
+              <w:t xml:space="preserve">• </w:t>
+            </w:r>
+            <w:r>
+              <w:rPr>
+                <w:b w:val="0"/>
+                <w:i w:val="0"/>
+                <w:sz w:val="18"/>
+              </w:rPr>
+              <w:t>Define what will be measured</w:t>
+            </w:r>
+          </w:p>
+          <w:p>
+            <w:pPr>
+              <w:spacing w:before="0" w:after="30" w:lineRule="exact" w:line="209"/>
+              <w:ind w:left="140" w:hanging="140"/>
+              <w:jc w:val="left"/>
+            </w:pPr>
+            <w:r>
+              <w:rPr>
+                <w:color w:val="14453F"/>
+                <w:sz w:val="18"/>
+              </w:rPr>
+              <w:t xml:space="preserve">• </w:t>
+            </w:r>
+            <w:r>
+              <w:rPr>
+                <w:b w:val="0"/>
+                <w:i w:val="0"/>
+                <w:sz w:val="18"/>
+              </w:rPr>
+              <w:t>Instrument provider acquisition so every paying provider records how it reached Olera</w:t>
             </w:r>
           </w:p>
         </w:tc>
@@ -3620,17 +3746,91 @@
           </w:tcPr>
           <w:p>
             <w:pPr>
-              <w:spacing w:before="56" w:after="56" w:lineRule="exact" w:line="209"/>
+              <w:spacing w:before="56" w:after="30" w:lineRule="exact" w:line="209"/>
+              <w:ind w:left="140" w:hanging="140"/>
               <w:jc w:val="left"/>
             </w:pPr>
             <w:r/>
+            <w:r>
+              <w:rPr>
+                <w:color w:val="14453F"/>
+                <w:sz w:val="18"/>
+              </w:rPr>
+              <w:t xml:space="preserve">• </w:t>
+            </w:r>
             <w:r>
               <w:rPr>
                 <w:b w:val="0"/>
                 <w:i w:val="0"/>
                 <w:sz w:val="18"/>
               </w:rPr>
-              <w:t>Launch concentrated provider outreach; finish institutional-buyer hypothesis/interview guide; book first MA/ACO conversations; draft the letter of intent buyers will eventually be asked to sign.</w:t>
+              <w:t>Launch concentrated provider outreach</w:t>
+            </w:r>
+          </w:p>
+          <w:p>
+            <w:pPr>
+              <w:spacing w:before="0" w:after="30" w:lineRule="exact" w:line="209"/>
+              <w:ind w:left="140" w:hanging="140"/>
+              <w:jc w:val="left"/>
+            </w:pPr>
+            <w:r>
+              <w:rPr>
+                <w:color w:val="14453F"/>
+                <w:sz w:val="18"/>
+              </w:rPr>
+              <w:t xml:space="preserve">• </w:t>
+            </w:r>
+            <w:r>
+              <w:rPr>
+                <w:b w:val="0"/>
+                <w:i w:val="0"/>
+                <w:sz w:val="18"/>
+              </w:rPr>
+              <w:t>Finish institutional-buyer hypothesis/interview guide</w:t>
+            </w:r>
+          </w:p>
+          <w:p>
+            <w:pPr>
+              <w:spacing w:before="0" w:after="30" w:lineRule="exact" w:line="209"/>
+              <w:ind w:left="140" w:hanging="140"/>
+              <w:jc w:val="left"/>
+            </w:pPr>
+            <w:r>
+              <w:rPr>
+                <w:color w:val="14453F"/>
+                <w:sz w:val="18"/>
+              </w:rPr>
+              <w:t xml:space="preserve">• </w:t>
+            </w:r>
+            <w:r>
+              <w:rPr>
+                <w:b w:val="0"/>
+                <w:i w:val="0"/>
+                <w:sz w:val="18"/>
+              </w:rPr>
+              <w:t>Book first MA/ACO conversations</w:t>
+            </w:r>
+          </w:p>
+          <w:p>
+            <w:pPr>
+              <w:spacing w:before="0" w:after="30" w:lineRule="exact" w:line="209"/>
+              <w:ind w:left="140" w:hanging="140"/>
+              <w:jc w:val="left"/>
+            </w:pPr>
+            <w:r>
+              <w:rPr>
+                <w:color w:val="14453F"/>
+                <w:sz w:val="18"/>
+              </w:rPr>
+              <w:t xml:space="preserve">• </w:t>
+            </w:r>
+            <w:r>
+              <w:rPr>
+                <w:b w:val="0"/>
+                <w:i w:val="0"/>
+                <w:sz w:val="18"/>
+              </w:rPr>
+              <w:t>Draft the letter of intent buyers will eventually be asked to sign</w:t>
             </w:r>
           </w:p>
         </w:tc>
@@ -3718,17 +3918,91 @@
           </w:tcPr>
           <w:p>
             <w:pPr>
-              <w:spacing w:before="56" w:after="56" w:lineRule="exact" w:line="209"/>
+              <w:spacing w:before="56" w:after="30" w:lineRule="exact" w:line="209"/>
+              <w:ind w:left="140" w:hanging="140"/>
               <w:jc w:val="left"/>
             </w:pPr>
             <w:r/>
+            <w:r>
+              <w:rPr>
+                <w:color w:val="14453F"/>
+                <w:sz w:val="18"/>
+              </w:rPr>
+              <w:t xml:space="preserve">• </w:t>
+            </w:r>
             <w:r>
               <w:rPr>
                 <w:b w:val="0"/>
                 <w:i w:val="0"/>
                 <w:sz w:val="18"/>
               </w:rPr>
-              <w:t>Freeze first-generation CareNavigator requirements and V&amp;V plan; add care-establishment verification to the study instrumentation so episodes reaching established care can be counted; continue sales; conduct first buyer interviews.</w:t>
+              <w:t>Freeze first-generation CareNavigator requirements and V&amp;V plan</w:t>
+            </w:r>
+          </w:p>
+          <w:p>
+            <w:pPr>
+              <w:spacing w:before="0" w:after="30" w:lineRule="exact" w:line="209"/>
+              <w:ind w:left="140" w:hanging="140"/>
+              <w:jc w:val="left"/>
+            </w:pPr>
+            <w:r>
+              <w:rPr>
+                <w:color w:val="14453F"/>
+                <w:sz w:val="18"/>
+              </w:rPr>
+              <w:t xml:space="preserve">• </w:t>
+            </w:r>
+            <w:r>
+              <w:rPr>
+                <w:b w:val="0"/>
+                <w:i w:val="0"/>
+                <w:sz w:val="18"/>
+              </w:rPr>
+              <w:t>Add care-establishment verification to the study instrumentation so episodes reaching established care can be counted</w:t>
+            </w:r>
+          </w:p>
+          <w:p>
+            <w:pPr>
+              <w:spacing w:before="0" w:after="30" w:lineRule="exact" w:line="209"/>
+              <w:ind w:left="140" w:hanging="140"/>
+              <w:jc w:val="left"/>
+            </w:pPr>
+            <w:r>
+              <w:rPr>
+                <w:color w:val="14453F"/>
+                <w:sz w:val="18"/>
+              </w:rPr>
+              <w:t xml:space="preserve">• </w:t>
+            </w:r>
+            <w:r>
+              <w:rPr>
+                <w:b w:val="0"/>
+                <w:i w:val="0"/>
+                <w:sz w:val="18"/>
+              </w:rPr>
+              <w:t>Continue sales</w:t>
+            </w:r>
+          </w:p>
+          <w:p>
+            <w:pPr>
+              <w:spacing w:before="0" w:after="30" w:lineRule="exact" w:line="209"/>
+              <w:ind w:left="140" w:hanging="140"/>
+              <w:jc w:val="left"/>
+            </w:pPr>
+            <w:r>
+              <w:rPr>
+                <w:color w:val="14453F"/>
+                <w:sz w:val="18"/>
+              </w:rPr>
+              <w:t xml:space="preserve">• </w:t>
+            </w:r>
+            <w:r>
+              <w:rPr>
+                <w:b w:val="0"/>
+                <w:i w:val="0"/>
+                <w:sz w:val="18"/>
+              </w:rPr>
+              <w:t>Conduct first buyer interviews</w:t>
             </w:r>
           </w:p>
         </w:tc>
@@ -3816,17 +4090,69 @@
           </w:tcPr>
           <w:p>
             <w:pPr>
-              <w:spacing w:before="56" w:after="56" w:lineRule="exact" w:line="209"/>
+              <w:spacing w:before="56" w:after="30" w:lineRule="exact" w:line="209"/>
+              <w:ind w:left="140" w:hanging="140"/>
               <w:jc w:val="left"/>
             </w:pPr>
             <w:r/>
+            <w:r>
+              <w:rPr>
+                <w:color w:val="14453F"/>
+                <w:sz w:val="18"/>
+              </w:rPr>
+              <w:t xml:space="preserve">• </w:t>
+            </w:r>
             <w:r>
               <w:rPr>
                 <w:b w:val="0"/>
                 <w:i w:val="0"/>
                 <w:sz w:val="18"/>
               </w:rPr>
-              <w:t>Close first paying provider(s) and record the acquisition source of each; continue buyer interviews; review Month 1 against scorecard.</w:t>
+              <w:t>Close first paying provider(s) and record the acquisition source of each</w:t>
+            </w:r>
+          </w:p>
+          <w:p>
+            <w:pPr>
+              <w:spacing w:before="0" w:after="30" w:lineRule="exact" w:line="209"/>
+              <w:ind w:left="140" w:hanging="140"/>
+              <w:jc w:val="left"/>
+            </w:pPr>
+            <w:r>
+              <w:rPr>
+                <w:color w:val="14453F"/>
+                <w:sz w:val="18"/>
+              </w:rPr>
+              <w:t xml:space="preserve">• </w:t>
+            </w:r>
+            <w:r>
+              <w:rPr>
+                <w:b w:val="0"/>
+                <w:i w:val="0"/>
+                <w:sz w:val="18"/>
+              </w:rPr>
+              <w:t>Continue buyer interviews</w:t>
+            </w:r>
+          </w:p>
+          <w:p>
+            <w:pPr>
+              <w:spacing w:before="0" w:after="30" w:lineRule="exact" w:line="209"/>
+              <w:ind w:left="140" w:hanging="140"/>
+              <w:jc w:val="left"/>
+            </w:pPr>
+            <w:r>
+              <w:rPr>
+                <w:color w:val="14453F"/>
+                <w:sz w:val="18"/>
+              </w:rPr>
+              <w:t xml:space="preserve">• </w:t>
+            </w:r>
+            <w:r>
+              <w:rPr>
+                <w:b w:val="0"/>
+                <w:i w:val="0"/>
+                <w:sz w:val="18"/>
+              </w:rPr>
+              <w:t>Review Month 1 against scorecard</w:t>
             </w:r>
           </w:p>
         </w:tc>
@@ -3914,17 +4240,91 @@
           </w:tcPr>
           <w:p>
             <w:pPr>
-              <w:spacing w:before="56" w:after="56" w:lineRule="exact" w:line="209"/>
+              <w:spacing w:before="56" w:after="30" w:lineRule="exact" w:line="209"/>
+              <w:ind w:left="140" w:hanging="140"/>
               <w:jc w:val="left"/>
             </w:pPr>
             <w:r/>
+            <w:r>
+              <w:rPr>
+                <w:color w:val="14453F"/>
+                <w:sz w:val="18"/>
+              </w:rPr>
+              <w:t xml:space="preserve">• </w:t>
+            </w:r>
             <w:r>
               <w:rPr>
                 <w:b w:val="0"/>
                 <w:i w:val="0"/>
                 <w:sz w:val="18"/>
               </w:rPr>
-              <w:t>Standardize delivery from first customers; continue buyer discovery; complete study-ready CareNavigator workflows; open investor conversations against the $4 million post-CRP requirement.</w:t>
+              <w:t>Standardize delivery from first customers</w:t>
+            </w:r>
+          </w:p>
+          <w:p>
+            <w:pPr>
+              <w:spacing w:before="0" w:after="30" w:lineRule="exact" w:line="209"/>
+              <w:ind w:left="140" w:hanging="140"/>
+              <w:jc w:val="left"/>
+            </w:pPr>
+            <w:r>
+              <w:rPr>
+                <w:color w:val="14453F"/>
+                <w:sz w:val="18"/>
+              </w:rPr>
+              <w:t xml:space="preserve">• </w:t>
+            </w:r>
+            <w:r>
+              <w:rPr>
+                <w:b w:val="0"/>
+                <w:i w:val="0"/>
+                <w:sz w:val="18"/>
+              </w:rPr>
+              <w:t>Continue buyer discovery</w:t>
+            </w:r>
+          </w:p>
+          <w:p>
+            <w:pPr>
+              <w:spacing w:before="0" w:after="30" w:lineRule="exact" w:line="209"/>
+              <w:ind w:left="140" w:hanging="140"/>
+              <w:jc w:val="left"/>
+            </w:pPr>
+            <w:r>
+              <w:rPr>
+                <w:color w:val="14453F"/>
+                <w:sz w:val="18"/>
+              </w:rPr>
+              <w:t xml:space="preserve">• </w:t>
+            </w:r>
+            <w:r>
+              <w:rPr>
+                <w:b w:val="0"/>
+                <w:i w:val="0"/>
+                <w:sz w:val="18"/>
+              </w:rPr>
+              <w:t>Complete study-ready CareNavigator workflows</w:t>
+            </w:r>
+          </w:p>
+          <w:p>
+            <w:pPr>
+              <w:spacing w:before="0" w:after="30" w:lineRule="exact" w:line="209"/>
+              <w:ind w:left="140" w:hanging="140"/>
+              <w:jc w:val="left"/>
+            </w:pPr>
+            <w:r>
+              <w:rPr>
+                <w:color w:val="14453F"/>
+                <w:sz w:val="18"/>
+              </w:rPr>
+              <w:t xml:space="preserve">• </w:t>
+            </w:r>
+            <w:r>
+              <w:rPr>
+                <w:b w:val="0"/>
+                <w:i w:val="0"/>
+                <w:sz w:val="18"/>
+              </w:rPr>
+              <w:t>Open investor conversations against the $4 million post-CRP requirement</w:t>
             </w:r>
           </w:p>
         </w:tc>
@@ -4012,17 +4412,91 @@
           </w:tcPr>
           <w:p>
             <w:pPr>
-              <w:spacing w:before="56" w:after="56" w:lineRule="exact" w:line="209"/>
+              <w:spacing w:before="56" w:after="30" w:lineRule="exact" w:line="209"/>
+              <w:ind w:left="140" w:hanging="140"/>
               <w:jc w:val="left"/>
             </w:pPr>
             <w:r/>
+            <w:r>
+              <w:rPr>
+                <w:color w:val="14453F"/>
+                <w:sz w:val="18"/>
+              </w:rPr>
+              <w:t xml:space="preserve">• </w:t>
+            </w:r>
             <w:r>
               <w:rPr>
                 <w:b w:val="0"/>
                 <w:i w:val="0"/>
                 <w:sz w:val="18"/>
               </w:rPr>
-              <w:t>Convert next provider cohort; pursue first repeat purchase/retention evidence; begin/continue family V&amp;V study; ask each buyer what would have to be true for them to put something in writing.</w:t>
+              <w:t>Convert next provider cohort</w:t>
+            </w:r>
+          </w:p>
+          <w:p>
+            <w:pPr>
+              <w:spacing w:before="0" w:after="30" w:lineRule="exact" w:line="209"/>
+              <w:ind w:left="140" w:hanging="140"/>
+              <w:jc w:val="left"/>
+            </w:pPr>
+            <w:r>
+              <w:rPr>
+                <w:color w:val="14453F"/>
+                <w:sz w:val="18"/>
+              </w:rPr>
+              <w:t xml:space="preserve">• </w:t>
+            </w:r>
+            <w:r>
+              <w:rPr>
+                <w:b w:val="0"/>
+                <w:i w:val="0"/>
+                <w:sz w:val="18"/>
+              </w:rPr>
+              <w:t>Pursue first repeat purchase/retention evidence</w:t>
+            </w:r>
+          </w:p>
+          <w:p>
+            <w:pPr>
+              <w:spacing w:before="0" w:after="30" w:lineRule="exact" w:line="209"/>
+              <w:ind w:left="140" w:hanging="140"/>
+              <w:jc w:val="left"/>
+            </w:pPr>
+            <w:r>
+              <w:rPr>
+                <w:color w:val="14453F"/>
+                <w:sz w:val="18"/>
+              </w:rPr>
+              <w:t xml:space="preserve">• </w:t>
+            </w:r>
+            <w:r>
+              <w:rPr>
+                <w:b w:val="0"/>
+                <w:i w:val="0"/>
+                <w:sz w:val="18"/>
+              </w:rPr>
+              <w:t>Begin/continue family V&amp;V study</w:t>
+            </w:r>
+          </w:p>
+          <w:p>
+            <w:pPr>
+              <w:spacing w:before="0" w:after="30" w:lineRule="exact" w:line="209"/>
+              <w:ind w:left="140" w:hanging="140"/>
+              <w:jc w:val="left"/>
+            </w:pPr>
+            <w:r>
+              <w:rPr>
+                <w:color w:val="14453F"/>
+                <w:sz w:val="18"/>
+              </w:rPr>
+              <w:t xml:space="preserve">• </w:t>
+            </w:r>
+            <w:r>
+              <w:rPr>
+                <w:b w:val="0"/>
+                <w:i w:val="0"/>
+                <w:sz w:val="18"/>
+              </w:rPr>
+              <w:t>Ask each buyer what would have to be true for them to put something in writing</w:t>
             </w:r>
           </w:p>
         </w:tc>
@@ -4110,17 +4584,91 @@
           </w:tcPr>
           <w:p>
             <w:pPr>
-              <w:spacing w:before="56" w:after="56" w:lineRule="exact" w:line="209"/>
+              <w:spacing w:before="56" w:after="30" w:lineRule="exact" w:line="209"/>
+              <w:ind w:left="140" w:hanging="140"/>
               <w:jc w:val="left"/>
             </w:pPr>
             <w:r/>
+            <w:r>
+              <w:rPr>
+                <w:color w:val="14453F"/>
+                <w:sz w:val="18"/>
+              </w:rPr>
+              <w:t xml:space="preserve">• </w:t>
+            </w:r>
             <w:r>
               <w:rPr>
                 <w:b w:val="0"/>
                 <w:i w:val="0"/>
                 <w:sz w:val="18"/>
               </w:rPr>
-              <w:t>Synthesize buyer interviews; identify convergent endpoints, data requirements, and POC expectations; revise CRP architecture accordingly; put the first letter of intent in front of the most engaged buyer.</w:t>
+              <w:t>Synthesize buyer interviews</w:t>
+            </w:r>
+          </w:p>
+          <w:p>
+            <w:pPr>
+              <w:spacing w:before="0" w:after="30" w:lineRule="exact" w:line="209"/>
+              <w:ind w:left="140" w:hanging="140"/>
+              <w:jc w:val="left"/>
+            </w:pPr>
+            <w:r>
+              <w:rPr>
+                <w:color w:val="14453F"/>
+                <w:sz w:val="18"/>
+              </w:rPr>
+              <w:t xml:space="preserve">• </w:t>
+            </w:r>
+            <w:r>
+              <w:rPr>
+                <w:b w:val="0"/>
+                <w:i w:val="0"/>
+                <w:sz w:val="18"/>
+              </w:rPr>
+              <w:t>Identify convergent endpoints, data requirements, and POC expectations</w:t>
+            </w:r>
+          </w:p>
+          <w:p>
+            <w:pPr>
+              <w:spacing w:before="0" w:after="30" w:lineRule="exact" w:line="209"/>
+              <w:ind w:left="140" w:hanging="140"/>
+              <w:jc w:val="left"/>
+            </w:pPr>
+            <w:r>
+              <w:rPr>
+                <w:color w:val="14453F"/>
+                <w:sz w:val="18"/>
+              </w:rPr>
+              <w:t xml:space="preserve">• </w:t>
+            </w:r>
+            <w:r>
+              <w:rPr>
+                <w:b w:val="0"/>
+                <w:i w:val="0"/>
+                <w:sz w:val="18"/>
+              </w:rPr>
+              <w:t>Revise CRP architecture accordingly</w:t>
+            </w:r>
+          </w:p>
+          <w:p>
+            <w:pPr>
+              <w:spacing w:before="0" w:after="30" w:lineRule="exact" w:line="209"/>
+              <w:ind w:left="140" w:hanging="140"/>
+              <w:jc w:val="left"/>
+            </w:pPr>
+            <w:r>
+              <w:rPr>
+                <w:color w:val="14453F"/>
+                <w:sz w:val="18"/>
+              </w:rPr>
+              <w:t xml:space="preserve">• </w:t>
+            </w:r>
+            <w:r>
+              <w:rPr>
+                <w:b w:val="0"/>
+                <w:i w:val="0"/>
+                <w:sz w:val="18"/>
+              </w:rPr>
+              <w:t>Put the first letter of intent in front of the most engaged buyer</w:t>
             </w:r>
           </w:p>
         </w:tc>
@@ -4208,17 +4756,47 @@
           </w:tcPr>
           <w:p>
             <w:pPr>
-              <w:spacing w:before="56" w:after="56" w:lineRule="exact" w:line="209"/>
+              <w:spacing w:before="56" w:after="30" w:lineRule="exact" w:line="209"/>
+              <w:ind w:left="140" w:hanging="140"/>
               <w:jc w:val="left"/>
             </w:pPr>
             <w:r/>
+            <w:r>
+              <w:rPr>
+                <w:color w:val="14453F"/>
+                <w:sz w:val="18"/>
+              </w:rPr>
+              <w:t xml:space="preserve">• </w:t>
+            </w:r>
             <w:r>
               <w:rPr>
                 <w:b w:val="0"/>
                 <w:i w:val="0"/>
                 <w:sz w:val="18"/>
               </w:rPr>
-              <w:t>Review traction, CareNavigator development, study progress, buyer discovery, and financing against target/stretch scorecard; decide whether the letter and financing rows are on track or need a different approach.</w:t>
+              <w:t>Review traction, CareNavigator development, study progress, buyer discovery, and financing against target/stretch scorecard</w:t>
+            </w:r>
+          </w:p>
+          <w:p>
+            <w:pPr>
+              <w:spacing w:before="0" w:after="30" w:lineRule="exact" w:line="209"/>
+              <w:ind w:left="140" w:hanging="140"/>
+              <w:jc w:val="left"/>
+            </w:pPr>
+            <w:r>
+              <w:rPr>
+                <w:color w:val="14453F"/>
+                <w:sz w:val="18"/>
+              </w:rPr>
+              <w:t xml:space="preserve">• </w:t>
+            </w:r>
+            <w:r>
+              <w:rPr>
+                <w:b w:val="0"/>
+                <w:i w:val="0"/>
+                <w:sz w:val="18"/>
+              </w:rPr>
+              <w:t>Decide whether the letter and financing rows are on track or need a different approach</w:t>
             </w:r>
           </w:p>
         </w:tc>
@@ -4306,17 +4884,113 @@
           </w:tcPr>
           <w:p>
             <w:pPr>
-              <w:spacing w:before="56" w:after="56" w:lineRule="exact" w:line="209"/>
+              <w:spacing w:before="56" w:after="30" w:lineRule="exact" w:line="209"/>
+              <w:ind w:left="140" w:hanging="140"/>
               <w:jc w:val="left"/>
             </w:pPr>
             <w:r/>
+            <w:r>
+              <w:rPr>
+                <w:color w:val="14453F"/>
+                <w:sz w:val="18"/>
+              </w:rPr>
+              <w:t xml:space="preserve">• </w:t>
+            </w:r>
             <w:r>
               <w:rPr>
                 <w:b w:val="0"/>
                 <w:i w:val="0"/>
                 <w:sz w:val="18"/>
               </w:rPr>
-              <w:t>Meet targeted investors/buyers; test thesis; capture objections and required evidence; ask for written milestone-conditional interest rather than endorsement; continue sales and V&amp;V.</w:t>
+              <w:t>Meet targeted investors/buyers</w:t>
+            </w:r>
+          </w:p>
+          <w:p>
+            <w:pPr>
+              <w:spacing w:before="0" w:after="30" w:lineRule="exact" w:line="209"/>
+              <w:ind w:left="140" w:hanging="140"/>
+              <w:jc w:val="left"/>
+            </w:pPr>
+            <w:r>
+              <w:rPr>
+                <w:color w:val="14453F"/>
+                <w:sz w:val="18"/>
+              </w:rPr>
+              <w:t xml:space="preserve">• </w:t>
+            </w:r>
+            <w:r>
+              <w:rPr>
+                <w:b w:val="0"/>
+                <w:i w:val="0"/>
+                <w:sz w:val="18"/>
+              </w:rPr>
+              <w:t>Test thesis</w:t>
+            </w:r>
+          </w:p>
+          <w:p>
+            <w:pPr>
+              <w:spacing w:before="0" w:after="30" w:lineRule="exact" w:line="209"/>
+              <w:ind w:left="140" w:hanging="140"/>
+              <w:jc w:val="left"/>
+            </w:pPr>
+            <w:r>
+              <w:rPr>
+                <w:color w:val="14453F"/>
+                <w:sz w:val="18"/>
+              </w:rPr>
+              <w:t xml:space="preserve">• </w:t>
+            </w:r>
+            <w:r>
+              <w:rPr>
+                <w:b w:val="0"/>
+                <w:i w:val="0"/>
+                <w:sz w:val="18"/>
+              </w:rPr>
+              <w:t>Capture objections and required evidence</w:t>
+            </w:r>
+          </w:p>
+          <w:p>
+            <w:pPr>
+              <w:spacing w:before="0" w:after="30" w:lineRule="exact" w:line="209"/>
+              <w:ind w:left="140" w:hanging="140"/>
+              <w:jc w:val="left"/>
+            </w:pPr>
+            <w:r>
+              <w:rPr>
+                <w:color w:val="14453F"/>
+                <w:sz w:val="18"/>
+              </w:rPr>
+              <w:t xml:space="preserve">• </w:t>
+            </w:r>
+            <w:r>
+              <w:rPr>
+                <w:b w:val="0"/>
+                <w:i w:val="0"/>
+                <w:sz w:val="18"/>
+              </w:rPr>
+              <w:t>Ask for written milestone-conditional interest rather than endorsement</w:t>
+            </w:r>
+          </w:p>
+          <w:p>
+            <w:pPr>
+              <w:spacing w:before="0" w:after="30" w:lineRule="exact" w:line="209"/>
+              <w:ind w:left="140" w:hanging="140"/>
+              <w:jc w:val="left"/>
+            </w:pPr>
+            <w:r>
+              <w:rPr>
+                <w:color w:val="14453F"/>
+                <w:sz w:val="18"/>
+              </w:rPr>
+              <w:t xml:space="preserve">• </w:t>
+            </w:r>
+            <w:r>
+              <w:rPr>
+                <w:b w:val="0"/>
+                <w:i w:val="0"/>
+                <w:sz w:val="18"/>
+              </w:rPr>
+              <w:t>Continue sales and V&amp;V</w:t>
             </w:r>
           </w:p>
         </w:tc>
@@ -4404,17 +5078,91 @@
           </w:tcPr>
           <w:p>
             <w:pPr>
-              <w:spacing w:before="56" w:after="56" w:lineRule="exact" w:line="209"/>
+              <w:spacing w:before="56" w:after="30" w:lineRule="exact" w:line="209"/>
+              <w:ind w:left="140" w:hanging="140"/>
               <w:jc w:val="left"/>
             </w:pPr>
             <w:r/>
+            <w:r>
+              <w:rPr>
+                <w:color w:val="14453F"/>
+                <w:sz w:val="18"/>
+              </w:rPr>
+              <w:t xml:space="preserve">• </w:t>
+            </w:r>
             <w:r>
               <w:rPr>
                 <w:b w:val="0"/>
                 <w:i w:val="0"/>
                 <w:sz w:val="18"/>
               </w:rPr>
-              <w:t>Follow up within five days; move buyers toward a signed letter of intent; move investors toward documented interest at or above $4 million; record what each declined and why.</w:t>
+              <w:t>Follow up within five days</w:t>
+            </w:r>
+          </w:p>
+          <w:p>
+            <w:pPr>
+              <w:spacing w:before="0" w:after="30" w:lineRule="exact" w:line="209"/>
+              <w:ind w:left="140" w:hanging="140"/>
+              <w:jc w:val="left"/>
+            </w:pPr>
+            <w:r>
+              <w:rPr>
+                <w:color w:val="14453F"/>
+                <w:sz w:val="18"/>
+              </w:rPr>
+              <w:t xml:space="preserve">• </w:t>
+            </w:r>
+            <w:r>
+              <w:rPr>
+                <w:b w:val="0"/>
+                <w:i w:val="0"/>
+                <w:sz w:val="18"/>
+              </w:rPr>
+              <w:t>Move buyers toward a signed letter of intent</w:t>
+            </w:r>
+          </w:p>
+          <w:p>
+            <w:pPr>
+              <w:spacing w:before="0" w:after="30" w:lineRule="exact" w:line="209"/>
+              <w:ind w:left="140" w:hanging="140"/>
+              <w:jc w:val="left"/>
+            </w:pPr>
+            <w:r>
+              <w:rPr>
+                <w:color w:val="14453F"/>
+                <w:sz w:val="18"/>
+              </w:rPr>
+              <w:t xml:space="preserve">• </w:t>
+            </w:r>
+            <w:r>
+              <w:rPr>
+                <w:b w:val="0"/>
+                <w:i w:val="0"/>
+                <w:sz w:val="18"/>
+              </w:rPr>
+              <w:t>Move investors toward documented interest at or above $4 million</w:t>
+            </w:r>
+          </w:p>
+          <w:p>
+            <w:pPr>
+              <w:spacing w:before="0" w:after="30" w:lineRule="exact" w:line="209"/>
+              <w:ind w:left="140" w:hanging="140"/>
+              <w:jc w:val="left"/>
+            </w:pPr>
+            <w:r>
+              <w:rPr>
+                <w:color w:val="14453F"/>
+                <w:sz w:val="18"/>
+              </w:rPr>
+              <w:t xml:space="preserve">• </w:t>
+            </w:r>
+            <w:r>
+              <w:rPr>
+                <w:b w:val="0"/>
+                <w:i w:val="0"/>
+                <w:sz w:val="18"/>
+              </w:rPr>
+              <w:t>Record what each declined and why</w:t>
             </w:r>
           </w:p>
         </w:tc>
@@ -4502,17 +5250,69 @@
           </w:tcPr>
           <w:p>
             <w:pPr>
-              <w:spacing w:before="56" w:after="56" w:lineRule="exact" w:line="209"/>
+              <w:spacing w:before="56" w:after="30" w:lineRule="exact" w:line="209"/>
+              <w:ind w:left="140" w:hanging="140"/>
               <w:jc w:val="left"/>
             </w:pPr>
             <w:r/>
+            <w:r>
+              <w:rPr>
+                <w:color w:val="14453F"/>
+                <w:sz w:val="18"/>
+              </w:rPr>
+              <w:t xml:space="preserve">• </w:t>
+            </w:r>
             <w:r>
               <w:rPr>
                 <w:b w:val="0"/>
                 <w:i w:val="0"/>
                 <w:sz w:val="18"/>
               </w:rPr>
-              <w:t>Draft Research Strategy and Commercialization Plan from the now-better-supported thesis; state the proportionality answer explicitly, why $4 million against the modeled run rate; identify remaining evidence gaps.</w:t>
+              <w:t>Draft Research Strategy and Commercialization Plan from the now-better-supported thesis</w:t>
+            </w:r>
+          </w:p>
+          <w:p>
+            <w:pPr>
+              <w:spacing w:before="0" w:after="30" w:lineRule="exact" w:line="209"/>
+              <w:ind w:left="140" w:hanging="140"/>
+              <w:jc w:val="left"/>
+            </w:pPr>
+            <w:r>
+              <w:rPr>
+                <w:color w:val="14453F"/>
+                <w:sz w:val="18"/>
+              </w:rPr>
+              <w:t xml:space="preserve">• </w:t>
+            </w:r>
+            <w:r>
+              <w:rPr>
+                <w:b w:val="0"/>
+                <w:i w:val="0"/>
+                <w:sz w:val="18"/>
+              </w:rPr>
+              <w:t>State the proportionality answer explicitly, why $4 million against the modeled run rate</w:t>
+            </w:r>
+          </w:p>
+          <w:p>
+            <w:pPr>
+              <w:spacing w:before="0" w:after="30" w:lineRule="exact" w:line="209"/>
+              <w:ind w:left="140" w:hanging="140"/>
+              <w:jc w:val="left"/>
+            </w:pPr>
+            <w:r>
+              <w:rPr>
+                <w:color w:val="14453F"/>
+                <w:sz w:val="18"/>
+              </w:rPr>
+              <w:t xml:space="preserve">• </w:t>
+            </w:r>
+            <w:r>
+              <w:rPr>
+                <w:b w:val="0"/>
+                <w:i w:val="0"/>
+                <w:sz w:val="18"/>
+              </w:rPr>
+              <w:t>Identify remaining evidence gaps</w:t>
             </w:r>
           </w:p>
         </w:tc>
@@ -4600,17 +5400,25 @@
           </w:tcPr>
           <w:p>
             <w:pPr>
-              <w:spacing w:before="56" w:after="56" w:lineRule="exact" w:line="209"/>
+              <w:spacing w:before="56" w:after="30" w:lineRule="exact" w:line="209"/>
+              <w:ind w:left="140" w:hanging="140"/>
               <w:jc w:val="left"/>
             </w:pPr>
             <w:r/>
+            <w:r>
+              <w:rPr>
+                <w:color w:val="14453F"/>
+                <w:sz w:val="18"/>
+              </w:rPr>
+              <w:t xml:space="preserve">• </w:t>
+            </w:r>
             <w:r>
               <w:rPr>
                 <w:b w:val="0"/>
                 <w:i w:val="0"/>
                 <w:sz w:val="18"/>
               </w:rPr>
-              <w:t>Maintain sales, study execution, buyer follow-up, and evidence capture through the holiday week.</w:t>
+              <w:t>Maintain sales, study execution, buyer follow-up, and evidence capture through the holiday week</w:t>
             </w:r>
           </w:p>
         </w:tc>
@@ -4698,17 +5506,69 @@
           </w:tcPr>
           <w:p>
             <w:pPr>
-              <w:spacing w:before="56" w:after="56" w:lineRule="exact" w:line="209"/>
+              <w:spacing w:before="56" w:after="30" w:lineRule="exact" w:line="209"/>
+              <w:ind w:left="140" w:hanging="140"/>
               <w:jc w:val="left"/>
             </w:pPr>
             <w:r/>
+            <w:r>
+              <w:rPr>
+                <w:color w:val="14453F"/>
+                <w:sz w:val="18"/>
+              </w:rPr>
+              <w:t xml:space="preserve">• </w:t>
+            </w:r>
             <w:r>
               <w:rPr>
                 <w:b w:val="0"/>
                 <w:i w:val="0"/>
                 <w:sz w:val="18"/>
               </w:rPr>
-              <w:t>Show retention/repeat purchase; consolidate CareNavigator V&amp;V data and the care-establishment count; update economics and buyer evidence.</w:t>
+              <w:t>Show retention/repeat purchase</w:t>
+            </w:r>
+          </w:p>
+          <w:p>
+            <w:pPr>
+              <w:spacing w:before="0" w:after="30" w:lineRule="exact" w:line="209"/>
+              <w:ind w:left="140" w:hanging="140"/>
+              <w:jc w:val="left"/>
+            </w:pPr>
+            <w:r>
+              <w:rPr>
+                <w:color w:val="14453F"/>
+                <w:sz w:val="18"/>
+              </w:rPr>
+              <w:t xml:space="preserve">• </w:t>
+            </w:r>
+            <w:r>
+              <w:rPr>
+                <w:b w:val="0"/>
+                <w:i w:val="0"/>
+                <w:sz w:val="18"/>
+              </w:rPr>
+              <w:t>Consolidate CareNavigator V&amp;V data and the care-establishment count</w:t>
+            </w:r>
+          </w:p>
+          <w:p>
+            <w:pPr>
+              <w:spacing w:before="0" w:after="30" w:lineRule="exact" w:line="209"/>
+              <w:ind w:left="140" w:hanging="140"/>
+              <w:jc w:val="left"/>
+            </w:pPr>
+            <w:r>
+              <w:rPr>
+                <w:color w:val="14453F"/>
+                <w:sz w:val="18"/>
+              </w:rPr>
+              <w:t xml:space="preserve">• </w:t>
+            </w:r>
+            <w:r>
+              <w:rPr>
+                <w:b w:val="0"/>
+                <w:i w:val="0"/>
+                <w:sz w:val="18"/>
+              </w:rPr>
+              <w:t>Update economics and buyer evidence</w:t>
             </w:r>
           </w:p>
         </w:tc>
@@ -4796,17 +5656,69 @@
           </w:tcPr>
           <w:p>
             <w:pPr>
-              <w:spacing w:before="56" w:after="56" w:lineRule="exact" w:line="209"/>
+              <w:spacing w:before="56" w:after="30" w:lineRule="exact" w:line="209"/>
+              <w:ind w:left="140" w:hanging="140"/>
               <w:jc w:val="left"/>
             </w:pPr>
             <w:r/>
+            <w:r>
+              <w:rPr>
+                <w:color w:val="14453F"/>
+                <w:sz w:val="18"/>
+              </w:rPr>
+              <w:t xml:space="preserve">• </w:t>
+            </w:r>
             <w:r>
               <w:rPr>
                 <w:b w:val="0"/>
                 <w:i w:val="0"/>
                 <w:sz w:val="18"/>
               </w:rPr>
-              <w:t>Freeze core traction and study numbers; finalize buyer-informed CRP design; close the outstanding letters of intent and financing letters.</w:t>
+              <w:t>Freeze core traction and study numbers</w:t>
+            </w:r>
+          </w:p>
+          <w:p>
+            <w:pPr>
+              <w:spacing w:before="0" w:after="30" w:lineRule="exact" w:line="209"/>
+              <w:ind w:left="140" w:hanging="140"/>
+              <w:jc w:val="left"/>
+            </w:pPr>
+            <w:r>
+              <w:rPr>
+                <w:color w:val="14453F"/>
+                <w:sz w:val="18"/>
+              </w:rPr>
+              <w:t xml:space="preserve">• </w:t>
+            </w:r>
+            <w:r>
+              <w:rPr>
+                <w:b w:val="0"/>
+                <w:i w:val="0"/>
+                <w:sz w:val="18"/>
+              </w:rPr>
+              <w:t>Finalize buyer-informed CRP design</w:t>
+            </w:r>
+          </w:p>
+          <w:p>
+            <w:pPr>
+              <w:spacing w:before="0" w:after="30" w:lineRule="exact" w:line="209"/>
+              <w:ind w:left="140" w:hanging="140"/>
+              <w:jc w:val="left"/>
+            </w:pPr>
+            <w:r>
+              <w:rPr>
+                <w:color w:val="14453F"/>
+                <w:sz w:val="18"/>
+              </w:rPr>
+              <w:t xml:space="preserve">• </w:t>
+            </w:r>
+            <w:r>
+              <w:rPr>
+                <w:b w:val="0"/>
+                <w:i w:val="0"/>
+                <w:sz w:val="18"/>
+              </w:rPr>
+              <w:t>Close the outstanding letters of intent and financing letters</w:t>
             </w:r>
           </w:p>
         </w:tc>
@@ -4894,17 +5806,69 @@
           </w:tcPr>
           <w:p>
             <w:pPr>
-              <w:spacing w:before="56" w:after="56" w:lineRule="exact" w:line="209"/>
+              <w:spacing w:before="56" w:after="30" w:lineRule="exact" w:line="209"/>
+              <w:ind w:left="140" w:hanging="140"/>
               <w:jc w:val="left"/>
             </w:pPr>
             <w:r/>
+            <w:r>
+              <w:rPr>
+                <w:color w:val="14453F"/>
+                <w:sz w:val="18"/>
+              </w:rPr>
+              <w:t xml:space="preserve">• </w:t>
+            </w:r>
             <w:r>
               <w:rPr>
                 <w:b w:val="0"/>
                 <w:i w:val="0"/>
                 <w:sz w:val="18"/>
               </w:rPr>
-              <w:t>Complete substantive sections and internal review; assemble letters and supporting materials; finalize scorecard and report honestly which rows were retired and which were not.</w:t>
+              <w:t>Complete substantive sections and internal review</w:t>
+            </w:r>
+          </w:p>
+          <w:p>
+            <w:pPr>
+              <w:spacing w:before="0" w:after="30" w:lineRule="exact" w:line="209"/>
+              <w:ind w:left="140" w:hanging="140"/>
+              <w:jc w:val="left"/>
+            </w:pPr>
+            <w:r>
+              <w:rPr>
+                <w:color w:val="14453F"/>
+                <w:sz w:val="18"/>
+              </w:rPr>
+              <w:t xml:space="preserve">• </w:t>
+            </w:r>
+            <w:r>
+              <w:rPr>
+                <w:b w:val="0"/>
+                <w:i w:val="0"/>
+                <w:sz w:val="18"/>
+              </w:rPr>
+              <w:t>Assemble letters and supporting materials</w:t>
+            </w:r>
+          </w:p>
+          <w:p>
+            <w:pPr>
+              <w:spacing w:before="0" w:after="30" w:lineRule="exact" w:line="209"/>
+              <w:ind w:left="140" w:hanging="140"/>
+              <w:jc w:val="left"/>
+            </w:pPr>
+            <w:r>
+              <w:rPr>
+                <w:color w:val="14453F"/>
+                <w:sz w:val="18"/>
+              </w:rPr>
+              <w:t xml:space="preserve">• </w:t>
+            </w:r>
+            <w:r>
+              <w:rPr>
+                <w:b w:val="0"/>
+                <w:i w:val="0"/>
+                <w:sz w:val="18"/>
+              </w:rPr>
+              <w:t>Finalize scorecard and report honestly which rows were retired and which were not</w:t>
             </w:r>
           </w:p>
         </w:tc>
@@ -4992,17 +5956,69 @@
           </w:tcPr>
           <w:p>
             <w:pPr>
-              <w:spacing w:before="56" w:after="56" w:lineRule="exact" w:line="209"/>
+              <w:spacing w:before="56" w:after="30" w:lineRule="exact" w:line="209"/>
+              <w:ind w:left="140" w:hanging="140"/>
               <w:jc w:val="left"/>
             </w:pPr>
             <w:r/>
+            <w:r>
+              <w:rPr>
+                <w:color w:val="14453F"/>
+                <w:sz w:val="18"/>
+              </w:rPr>
+              <w:t xml:space="preserve">• </w:t>
+            </w:r>
             <w:r>
               <w:rPr>
                 <w:b w:val="0"/>
                 <w:i w:val="0"/>
                 <w:sz w:val="18"/>
               </w:rPr>
-              <w:t>Resolve remaining material gaps; avoid starting new initiatives; proof and reconcile application.</w:t>
+              <w:t>Resolve remaining material gaps</w:t>
+            </w:r>
+          </w:p>
+          <w:p>
+            <w:pPr>
+              <w:spacing w:before="0" w:after="30" w:lineRule="exact" w:line="209"/>
+              <w:ind w:left="140" w:hanging="140"/>
+              <w:jc w:val="left"/>
+            </w:pPr>
+            <w:r>
+              <w:rPr>
+                <w:color w:val="14453F"/>
+                <w:sz w:val="18"/>
+              </w:rPr>
+              <w:t xml:space="preserve">• </w:t>
+            </w:r>
+            <w:r>
+              <w:rPr>
+                <w:b w:val="0"/>
+                <w:i w:val="0"/>
+                <w:sz w:val="18"/>
+              </w:rPr>
+              <w:t>Avoid starting new initiatives</w:t>
+            </w:r>
+          </w:p>
+          <w:p>
+            <w:pPr>
+              <w:spacing w:before="0" w:after="30" w:lineRule="exact" w:line="209"/>
+              <w:ind w:left="140" w:hanging="140"/>
+              <w:jc w:val="left"/>
+            </w:pPr>
+            <w:r>
+              <w:rPr>
+                <w:color w:val="14453F"/>
+                <w:sz w:val="18"/>
+              </w:rPr>
+              <w:t xml:space="preserve">• </w:t>
+            </w:r>
+            <w:r>
+              <w:rPr>
+                <w:b w:val="0"/>
+                <w:i w:val="0"/>
+                <w:sz w:val="18"/>
+              </w:rPr>
+              <w:t>Proof and reconcile application</w:t>
             </w:r>
           </w:p>
         </w:tc>
@@ -5090,17 +6106,69 @@
           </w:tcPr>
           <w:p>
             <w:pPr>
-              <w:spacing w:before="56" w:after="56" w:lineRule="exact" w:line="209"/>
+              <w:spacing w:before="56" w:after="30" w:lineRule="exact" w:line="209"/>
+              <w:ind w:left="140" w:hanging="140"/>
               <w:jc w:val="left"/>
             </w:pPr>
             <w:r/>
+            <w:r>
+              <w:rPr>
+                <w:color w:val="14453F"/>
+                <w:sz w:val="18"/>
+              </w:rPr>
+              <w:t xml:space="preserve">• </w:t>
+            </w:r>
             <w:r>
               <w:rPr>
                 <w:b w:val="0"/>
                 <w:i w:val="0"/>
                 <w:sz w:val="18"/>
               </w:rPr>
-              <w:t>Final compliance check; final edits and assembly; submit.</w:t>
+              <w:t>Final compliance check</w:t>
+            </w:r>
+          </w:p>
+          <w:p>
+            <w:pPr>
+              <w:spacing w:before="0" w:after="30" w:lineRule="exact" w:line="209"/>
+              <w:ind w:left="140" w:hanging="140"/>
+              <w:jc w:val="left"/>
+            </w:pPr>
+            <w:r>
+              <w:rPr>
+                <w:color w:val="14453F"/>
+                <w:sz w:val="18"/>
+              </w:rPr>
+              <w:t xml:space="preserve">• </w:t>
+            </w:r>
+            <w:r>
+              <w:rPr>
+                <w:b w:val="0"/>
+                <w:i w:val="0"/>
+                <w:sz w:val="18"/>
+              </w:rPr>
+              <w:t>Final edits and assembly</w:t>
+            </w:r>
+          </w:p>
+          <w:p>
+            <w:pPr>
+              <w:spacing w:before="0" w:after="30" w:lineRule="exact" w:line="209"/>
+              <w:ind w:left="140" w:hanging="140"/>
+              <w:jc w:val="left"/>
+            </w:pPr>
+            <w:r>
+              <w:rPr>
+                <w:color w:val="14453F"/>
+                <w:sz w:val="18"/>
+              </w:rPr>
+              <w:t xml:space="preserve">• </w:t>
+            </w:r>
+            <w:r>
+              <w:rPr>
+                <w:b w:val="0"/>
+                <w:i w:val="0"/>
+                <w:sz w:val="18"/>
+              </w:rPr>
+              <w:t>Submit</w:t>
             </w:r>
           </w:p>
         </w:tc>
@@ -5137,7 +6205,7 @@
       <w:r>
         <w:drawing>
           <wp:inline xmlns:a="http://schemas.openxmlformats.org/drawingml/2006/main" xmlns:pic="http://schemas.openxmlformats.org/drawingml/2006/picture">
-            <wp:extent cx="6675120" cy="2308276"/>
+            <wp:extent cx="6675120" cy="2752878"/>
             <wp:docPr id="2" name="Picture 2"/>
             <wp:cNvGraphicFramePr>
               <a:graphicFrameLocks noChangeAspect="1"/>
@@ -5158,7 +6226,7 @@
                   <pic:spPr>
                     <a:xfrm>
                       <a:off x="0" y="0"/>
-                      <a:ext cx="6675120" cy="2308276"/>
+                      <a:ext cx="6675120" cy="2752878"/>
                     </a:xfrm>
                     <a:prstGeom prst="rect"/>
                   </pic:spPr>

</xml_diff>

<commit_message>
Make the week table scan
Three changes to Table 6, all presentational.

Standing work is set in grey. A task beginning "Continue" is carried over
from an earlier week, and several weeks are four or five of those around
one new item. In black they buried it. The greyed items also sort to the
bottom of each cell, so the week's new work reads first.

Job titles are cut to one idea each. Two-part titles joined by a
semicolon were the least scannable thing in the column; Week 6 keeps its
semicolon because both halves are milestones, and every other week is a
short verb phrase.

Task wording is front-loaded on the verb and trimmed of filler, and the
job column narrows from 21 to 18 percent to give the tasks more room.

Same tasks, same order within each week apart from the continuations
moving down. Six pages, PDF and Word beginning every page at the same
point.

Co-Authored-By: Claude Opus 5 <noreply@anthropic.com>
Claude-Session: https://claude.ai/code/session_01HAZLkLE85rjRAgcZW1sudJ
</commit_message>
<xml_diff>
--- a/docs/crp/Olera_Pre_CRP_RD_Commercialization_and_Execution_Plan.docx
+++ b/docs/crp/Olera_Pre_CRP_RD_Commercialization_and_Execution_Plan.docx
@@ -3232,8 +3232,8 @@
       <w:tblGrid>
         <w:gridCol w:w="756"/>
         <w:gridCol w:w="1296"/>
-        <w:gridCol w:w="2268"/>
-        <w:gridCol w:w="6480"/>
+        <w:gridCol w:w="1944"/>
+        <w:gridCol w:w="6804"/>
       </w:tblGrid>
       <w:tr>
         <w:trPr>
@@ -3292,7 +3292,7 @@
         </w:tc>
         <w:tc>
           <w:tcPr>
-            <w:tcW w:type="dxa" w:w="2268"/>
+            <w:tcW w:type="dxa" w:w="1944"/>
             <w:tcBorders>
               <w:bottom w:val="single" w:sz="8" w:space="0" w:color="14453F"/>
             </w:tcBorders>
@@ -3317,7 +3317,7 @@
         </w:tc>
         <w:tc>
           <w:tcPr>
-            <w:tcW w:type="dxa" w:w="6480"/>
+            <w:tcW w:type="dxa" w:w="6804"/>
             <w:tcBorders>
               <w:bottom w:val="single" w:sz="8" w:space="0" w:color="14453F"/>
             </w:tcBorders>
@@ -3394,7 +3394,7 @@
         </w:tc>
         <w:tc>
           <w:tcPr>
-            <w:tcW w:type="dxa" w:w="2268"/>
+            <w:tcW w:type="dxa" w:w="1944"/>
             <w:tcBorders>
               <w:bottom w:val="single" w:sz="2" w:space="0" w:color="B9C4BD"/>
             </w:tcBorders>
@@ -3411,13 +3411,13 @@
                 <w:i w:val="0"/>
                 <w:sz w:val="18"/>
               </w:rPr>
-              <w:t>Decide on direction</w:t>
+              <w:t>Set direction</w:t>
             </w:r>
           </w:p>
         </w:tc>
         <w:tc>
           <w:tcPr>
-            <w:tcW w:type="dxa" w:w="6480"/>
+            <w:tcW w:type="dxa" w:w="6804"/>
             <w:tcBorders>
               <w:bottom w:val="single" w:sz="2" w:space="0" w:color="B9C4BD"/>
             </w:tcBorders>
@@ -3544,7 +3544,7 @@
         </w:tc>
         <w:tc>
           <w:tcPr>
-            <w:tcW w:type="dxa" w:w="2268"/>
+            <w:tcW w:type="dxa" w:w="1944"/>
             <w:tcBorders>
               <w:bottom w:val="single" w:sz="2" w:space="0" w:color="B9C4BD"/>
             </w:tcBorders>
@@ -3561,13 +3561,13 @@
                 <w:i w:val="0"/>
                 <w:sz w:val="18"/>
               </w:rPr>
-              <w:t>Prepare the offers, the interviews, and the build</w:t>
+              <w:t>Prepare to launch</w:t>
             </w:r>
           </w:p>
         </w:tc>
         <w:tc>
           <w:tcPr>
-            <w:tcW w:type="dxa" w:w="6480"/>
+            <w:tcW w:type="dxa" w:w="6804"/>
             <w:tcBorders>
               <w:bottom w:val="single" w:sz="2" w:space="0" w:color="B9C4BD"/>
             </w:tcBorders>
@@ -3614,7 +3614,7 @@
                 <w:i w:val="0"/>
                 <w:sz w:val="18"/>
               </w:rPr>
-              <w:t>Finalize the Client Growth customer acquisition strategy</w:t>
+              <w:t>Finalize the Client Growth acquisition strategy</w:t>
             </w:r>
           </w:p>
           <w:p>
@@ -3658,7 +3658,7 @@
                 <w:i w:val="0"/>
                 <w:sz w:val="18"/>
               </w:rPr>
-              <w:t>Build the target agency list for Client Growth and Staffing</w:t>
+              <w:t>Build the target agency list for both products</w:t>
             </w:r>
           </w:p>
           <w:p>
@@ -3746,7 +3746,7 @@
                 <w:i w:val="0"/>
                 <w:sz w:val="18"/>
               </w:rPr>
-              <w:t>Design the CareNavigator first generation</w:t>
+              <w:t>Design CareNavigator Gen 1</w:t>
             </w:r>
           </w:p>
         </w:tc>
@@ -3804,7 +3804,7 @@
         </w:tc>
         <w:tc>
           <w:tcPr>
-            <w:tcW w:type="dxa" w:w="2268"/>
+            <w:tcW w:type="dxa" w:w="1944"/>
             <w:tcBorders>
               <w:bottom w:val="single" w:sz="2" w:space="0" w:color="B9C4BD"/>
             </w:tcBorders>
@@ -3821,13 +3821,13 @@
                 <w:i w:val="0"/>
                 <w:sz w:val="18"/>
               </w:rPr>
-              <w:t>Start selling provider products</w:t>
+              <w:t>Start selling</w:t>
             </w:r>
           </w:p>
         </w:tc>
         <w:tc>
           <w:tcPr>
-            <w:tcW w:type="dxa" w:w="6480"/>
+            <w:tcW w:type="dxa" w:w="6804"/>
             <w:tcBorders>
               <w:bottom w:val="single" w:sz="2" w:space="0" w:color="B9C4BD"/>
             </w:tcBorders>
@@ -3874,7 +3874,7 @@
                 <w:i w:val="0"/>
                 <w:sz w:val="18"/>
               </w:rPr>
-              <w:t>Work Nashville Healthcare Sessions, September 13 to 15, for institutional buyer and investor introductions</w:t>
+              <w:t>Work Nashville Healthcare Sessions, September 13 to 15, for buyer and investor introductions</w:t>
             </w:r>
           </w:p>
           <w:p>
@@ -3998,7 +3998,7 @@
         </w:tc>
         <w:tc>
           <w:tcPr>
-            <w:tcW w:type="dxa" w:w="2268"/>
+            <w:tcW w:type="dxa" w:w="1944"/>
             <w:tcBorders>
               <w:bottom w:val="single" w:sz="2" w:space="0" w:color="B9C4BD"/>
             </w:tcBorders>
@@ -4015,13 +4015,13 @@
                 <w:i w:val="0"/>
                 <w:sz w:val="18"/>
               </w:rPr>
-              <w:t>Lock the pre-CRP product plan</w:t>
+              <w:t>Lock the product plan</w:t>
             </w:r>
           </w:p>
         </w:tc>
         <w:tc>
           <w:tcPr>
-            <w:tcW w:type="dxa" w:w="6480"/>
+            <w:tcW w:type="dxa" w:w="6804"/>
             <w:tcBorders>
               <w:bottom w:val="single" w:sz="2" w:space="0" w:color="B9C4BD"/>
             </w:tcBorders>
@@ -4068,7 +4068,7 @@
                 <w:i w:val="0"/>
                 <w:sz w:val="18"/>
               </w:rPr>
-              <w:t>Continue sales</w:t>
+              <w:t>Hold the first buyer interviews</w:t>
             </w:r>
           </w:p>
           <w:p>
@@ -4079,7 +4079,7 @@
             </w:pPr>
             <w:r>
               <w:rPr>
-                <w:color w:val="14453F"/>
+                <w:color w:val="5F6B64"/>
                 <w:sz w:val="18"/>
               </w:rPr>
               <w:t xml:space="preserve">• </w:t>
@@ -4088,9 +4088,10 @@
               <w:rPr>
                 <w:b w:val="0"/>
                 <w:i w:val="0"/>
+                <w:color w:val="5F6B64"/>
                 <w:sz w:val="18"/>
               </w:rPr>
-              <w:t>Conduct first buyer interviews</w:t>
+              <w:t>Continue sales</w:t>
             </w:r>
           </w:p>
         </w:tc>
@@ -4148,7 +4149,7 @@
         </w:tc>
         <w:tc>
           <w:tcPr>
-            <w:tcW w:type="dxa" w:w="2268"/>
+            <w:tcW w:type="dxa" w:w="1944"/>
             <w:tcBorders>
               <w:bottom w:val="single" w:sz="2" w:space="0" w:color="B9C4BD"/>
             </w:tcBorders>
@@ -4171,7 +4172,7 @@
         </w:tc>
         <w:tc>
           <w:tcPr>
-            <w:tcW w:type="dxa" w:w="6480"/>
+            <w:tcW w:type="dxa" w:w="6804"/>
             <w:tcBorders>
               <w:bottom w:val="single" w:sz="2" w:space="0" w:color="B9C4BD"/>
             </w:tcBorders>
@@ -4196,7 +4197,7 @@
                 <w:i w:val="0"/>
                 <w:sz w:val="18"/>
               </w:rPr>
-              <w:t>Close first paying provider(s)</w:t>
+              <w:t>Close the first paying providers</w:t>
             </w:r>
           </w:p>
           <w:p>
@@ -4240,7 +4241,7 @@
                 <w:i w:val="0"/>
                 <w:sz w:val="18"/>
               </w:rPr>
-              <w:t>Continue buyer interviews</w:t>
+              <w:t>Finish CareNavigator Gen 1 v1</w:t>
             </w:r>
           </w:p>
           <w:p>
@@ -4251,7 +4252,7 @@
             </w:pPr>
             <w:r>
               <w:rPr>
-                <w:color w:val="14453F"/>
+                <w:color w:val="5F6B64"/>
                 <w:sz w:val="18"/>
               </w:rPr>
               <w:t xml:space="preserve">• </w:t>
@@ -4260,9 +4261,10 @@
               <w:rPr>
                 <w:b w:val="0"/>
                 <w:i w:val="0"/>
+                <w:color w:val="5F6B64"/>
                 <w:sz w:val="18"/>
               </w:rPr>
-              <w:t>Finish CareNavigator Gen 1 v1</w:t>
+              <w:t>Continue buyer interviews</w:t>
             </w:r>
           </w:p>
         </w:tc>
@@ -4320,7 +4322,7 @@
         </w:tc>
         <w:tc>
           <w:tcPr>
-            <w:tcW w:type="dxa" w:w="2268"/>
+            <w:tcW w:type="dxa" w:w="1944"/>
             <w:tcBorders>
               <w:bottom w:val="single" w:sz="2" w:space="0" w:color="B9C4BD"/>
             </w:tcBorders>
@@ -4337,13 +4339,13 @@
                 <w:i w:val="0"/>
                 <w:sz w:val="18"/>
               </w:rPr>
-              <w:t>Open the financing conversation; start the study</w:t>
+              <w:t>Open financing; start the study</w:t>
             </w:r>
           </w:p>
         </w:tc>
         <w:tc>
           <w:tcPr>
-            <w:tcW w:type="dxa" w:w="6480"/>
+            <w:tcW w:type="dxa" w:w="6804"/>
             <w:tcBorders>
               <w:bottom w:val="single" w:sz="2" w:space="0" w:color="B9C4BD"/>
             </w:tcBorders>
@@ -4355,28 +4357,6 @@
               <w:jc w:val="left"/>
             </w:pPr>
             <w:r/>
-            <w:r>
-              <w:rPr>
-                <w:color w:val="14453F"/>
-                <w:sz w:val="18"/>
-              </w:rPr>
-              <w:t xml:space="preserve">• </w:t>
-            </w:r>
-            <w:r>
-              <w:rPr>
-                <w:b w:val="0"/>
-                <w:i w:val="0"/>
-                <w:sz w:val="18"/>
-              </w:rPr>
-              <w:t>Complete study-ready CareNavigator workflows</w:t>
-            </w:r>
-          </w:p>
-          <w:p>
-            <w:pPr>
-              <w:spacing w:before="0" w:after="30" w:lineRule="exact" w:line="209"/>
-              <w:ind w:left="140" w:hanging="140"/>
-              <w:jc w:val="left"/>
-            </w:pPr>
             <w:r>
               <w:rPr>
                 <w:color w:val="14453F"/>
@@ -4412,7 +4392,7 @@
                 <w:i w:val="0"/>
                 <w:sz w:val="18"/>
               </w:rPr>
-              <w:t>Continue buyer interviews</w:t>
+              <w:t>Begin the Phase IIB family study</w:t>
             </w:r>
           </w:p>
           <w:p>
@@ -4434,7 +4414,30 @@
                 <w:i w:val="0"/>
                 <w:sz w:val="18"/>
               </w:rPr>
-              <w:t>Begin the Phase IIB family study</w:t>
+              <w:t>Complete study-ready CareNavigator workflows</w:t>
+            </w:r>
+          </w:p>
+          <w:p>
+            <w:pPr>
+              <w:spacing w:before="0" w:after="30" w:lineRule="exact" w:line="209"/>
+              <w:ind w:left="140" w:hanging="140"/>
+              <w:jc w:val="left"/>
+            </w:pPr>
+            <w:r>
+              <w:rPr>
+                <w:color w:val="5F6B64"/>
+                <w:sz w:val="18"/>
+              </w:rPr>
+              <w:t xml:space="preserve">• </w:t>
+            </w:r>
+            <w:r>
+              <w:rPr>
+                <w:b w:val="0"/>
+                <w:i w:val="0"/>
+                <w:color w:val="5F6B64"/>
+                <w:sz w:val="18"/>
+              </w:rPr>
+              <w:t>Continue buyer interviews</w:t>
             </w:r>
           </w:p>
         </w:tc>
@@ -4492,7 +4495,7 @@
         </w:tc>
         <w:tc>
           <w:tcPr>
-            <w:tcW w:type="dxa" w:w="2268"/>
+            <w:tcW w:type="dxa" w:w="1944"/>
             <w:tcBorders>
               <w:bottom w:val="single" w:sz="2" w:space="0" w:color="B9C4BD"/>
             </w:tcBorders>
@@ -4515,7 +4518,7 @@
         </w:tc>
         <w:tc>
           <w:tcPr>
-            <w:tcW w:type="dxa" w:w="6480"/>
+            <w:tcW w:type="dxa" w:w="6804"/>
             <w:tcBorders>
               <w:bottom w:val="single" w:sz="2" w:space="0" w:color="B9C4BD"/>
             </w:tcBorders>
@@ -4584,7 +4587,7 @@
                 <w:i w:val="0"/>
                 <w:sz w:val="18"/>
               </w:rPr>
-              <w:t>Ask each buyer what would have to be true for them to put something in writing</w:t>
+              <w:t>Ask each buyer what would have to be true to put something in writing</w:t>
             </w:r>
           </w:p>
         </w:tc>
@@ -4642,7 +4645,7 @@
         </w:tc>
         <w:tc>
           <w:tcPr>
-            <w:tcW w:type="dxa" w:w="2268"/>
+            <w:tcW w:type="dxa" w:w="1944"/>
             <w:tcBorders>
               <w:bottom w:val="single" w:sz="2" w:space="0" w:color="B9C4BD"/>
             </w:tcBorders>
@@ -4665,7 +4668,7 @@
         </w:tc>
         <w:tc>
           <w:tcPr>
-            <w:tcW w:type="dxa" w:w="6480"/>
+            <w:tcW w:type="dxa" w:w="6804"/>
             <w:tcBorders>
               <w:bottom w:val="single" w:sz="2" w:space="0" w:color="B9C4BD"/>
             </w:tcBorders>
@@ -4701,7 +4704,7 @@
             </w:pPr>
             <w:r>
               <w:rPr>
-                <w:color w:val="14453F"/>
+                <w:color w:val="5F6B64"/>
                 <w:sz w:val="18"/>
               </w:rPr>
               <w:t xml:space="preserve">• </w:t>
@@ -4710,6 +4713,7 @@
               <w:rPr>
                 <w:b w:val="0"/>
                 <w:i w:val="0"/>
+                <w:color w:val="5F6B64"/>
                 <w:sz w:val="18"/>
               </w:rPr>
               <w:t>Continue provider sales</w:t>
@@ -4723,7 +4727,7 @@
             </w:pPr>
             <w:r>
               <w:rPr>
-                <w:color w:val="14453F"/>
+                <w:color w:val="5F6B64"/>
                 <w:sz w:val="18"/>
               </w:rPr>
               <w:t xml:space="preserve">• </w:t>
@@ -4732,6 +4736,7 @@
               <w:rPr>
                 <w:b w:val="0"/>
                 <w:i w:val="0"/>
+                <w:color w:val="5F6B64"/>
                 <w:sz w:val="18"/>
               </w:rPr>
               <w:t>Continue the Phase IIB study</w:t>
@@ -4745,7 +4750,7 @@
             </w:pPr>
             <w:r>
               <w:rPr>
-                <w:color w:val="14453F"/>
+                <w:color w:val="5F6B64"/>
                 <w:sz w:val="18"/>
               </w:rPr>
               <w:t xml:space="preserve">• </w:t>
@@ -4754,6 +4759,7 @@
               <w:rPr>
                 <w:b w:val="0"/>
                 <w:i w:val="0"/>
+                <w:color w:val="5F6B64"/>
                 <w:sz w:val="18"/>
               </w:rPr>
               <w:t>Continue investor conversations</w:t>
@@ -4814,7 +4820,7 @@
         </w:tc>
         <w:tc>
           <w:tcPr>
-            <w:tcW w:type="dxa" w:w="2268"/>
+            <w:tcW w:type="dxa" w:w="1944"/>
             <w:tcBorders>
               <w:bottom w:val="single" w:sz="2" w:space="0" w:color="B9C4BD"/>
             </w:tcBorders>
@@ -4831,13 +4837,13 @@
                 <w:i w:val="0"/>
                 <w:sz w:val="18"/>
               </w:rPr>
-              <w:t>Month 2 review; plan HLTH</w:t>
+              <w:t>Month 2 review</w:t>
             </w:r>
           </w:p>
         </w:tc>
         <w:tc>
           <w:tcPr>
-            <w:tcW w:type="dxa" w:w="6480"/>
+            <w:tcW w:type="dxa" w:w="6804"/>
             <w:tcBorders>
               <w:bottom w:val="single" w:sz="2" w:space="0" w:color="B9C4BD"/>
             </w:tcBorders>
@@ -4862,6 +4868,29 @@
                 <w:i w:val="0"/>
                 <w:sz w:val="18"/>
               </w:rPr>
+              <w:t>Plan HLTH meetings with buyers and investors</w:t>
+            </w:r>
+          </w:p>
+          <w:p>
+            <w:pPr>
+              <w:spacing w:before="0" w:after="30" w:lineRule="exact" w:line="209"/>
+              <w:ind w:left="140" w:hanging="140"/>
+              <w:jc w:val="left"/>
+            </w:pPr>
+            <w:r>
+              <w:rPr>
+                <w:color w:val="5F6B64"/>
+                <w:sz w:val="18"/>
+              </w:rPr>
+              <w:t xml:space="preserve">• </w:t>
+            </w:r>
+            <w:r>
+              <w:rPr>
+                <w:b w:val="0"/>
+                <w:i w:val="0"/>
+                <w:color w:val="5F6B64"/>
+                <w:sz w:val="18"/>
+              </w:rPr>
               <w:t>Continue provider sales</w:t>
             </w:r>
           </w:p>
@@ -4873,7 +4902,7 @@
             </w:pPr>
             <w:r>
               <w:rPr>
-                <w:color w:val="14453F"/>
+                <w:color w:val="5F6B64"/>
                 <w:sz w:val="18"/>
               </w:rPr>
               <w:t xml:space="preserve">• </w:t>
@@ -4882,6 +4911,7 @@
               <w:rPr>
                 <w:b w:val="0"/>
                 <w:i w:val="0"/>
+                <w:color w:val="5F6B64"/>
                 <w:sz w:val="18"/>
               </w:rPr>
               <w:t>Continue the Phase IIB study</w:t>
@@ -4895,7 +4925,7 @@
             </w:pPr>
             <w:r>
               <w:rPr>
-                <w:color w:val="14453F"/>
+                <w:color w:val="5F6B64"/>
                 <w:sz w:val="18"/>
               </w:rPr>
               <w:t xml:space="preserve">• </w:t>
@@ -4904,6 +4934,7 @@
               <w:rPr>
                 <w:b w:val="0"/>
                 <w:i w:val="0"/>
+                <w:color w:val="5F6B64"/>
                 <w:sz w:val="18"/>
               </w:rPr>
               <w:t>Continue investor conversations</w:t>
@@ -4917,7 +4948,7 @@
             </w:pPr>
             <w:r>
               <w:rPr>
-                <w:color w:val="14453F"/>
+                <w:color w:val="5F6B64"/>
                 <w:sz w:val="18"/>
               </w:rPr>
               <w:t xml:space="preserve">• </w:t>
@@ -4926,31 +4957,10 @@
               <w:rPr>
                 <w:b w:val="0"/>
                 <w:i w:val="0"/>
+                <w:color w:val="5F6B64"/>
                 <w:sz w:val="18"/>
               </w:rPr>
               <w:t>Continue buyer conversations</w:t>
-            </w:r>
-          </w:p>
-          <w:p>
-            <w:pPr>
-              <w:spacing w:before="0" w:after="30" w:lineRule="exact" w:line="209"/>
-              <w:ind w:left="140" w:hanging="140"/>
-              <w:jc w:val="left"/>
-            </w:pPr>
-            <w:r>
-              <w:rPr>
-                <w:color w:val="14453F"/>
-                <w:sz w:val="18"/>
-              </w:rPr>
-              <w:t xml:space="preserve">• </w:t>
-            </w:r>
-            <w:r>
-              <w:rPr>
-                <w:b w:val="0"/>
-                <w:i w:val="0"/>
-                <w:sz w:val="18"/>
-              </w:rPr>
-              <w:t>Plan HLTH meetings with buyers and investors</w:t>
             </w:r>
           </w:p>
         </w:tc>
@@ -5008,7 +5018,7 @@
         </w:tc>
         <w:tc>
           <w:tcPr>
-            <w:tcW w:type="dxa" w:w="2268"/>
+            <w:tcW w:type="dxa" w:w="1944"/>
             <w:tcBorders>
               <w:bottom w:val="single" w:sz="2" w:space="0" w:color="B9C4BD"/>
             </w:tcBorders>
@@ -5031,7 +5041,7 @@
         </w:tc>
         <w:tc>
           <w:tcPr>
-            <w:tcW w:type="dxa" w:w="6480"/>
+            <w:tcW w:type="dxa" w:w="6804"/>
             <w:tcBorders>
               <w:bottom w:val="single" w:sz="2" w:space="0" w:color="B9C4BD"/>
             </w:tcBorders>
@@ -5078,7 +5088,7 @@
                 <w:i w:val="0"/>
                 <w:sz w:val="18"/>
               </w:rPr>
-              <w:t>Finalize the letter of intent and the $4 million financing ask so both are ready to hand over</w:t>
+              <w:t>Finalize the letter of intent and the $4 million ask, ready to hand over</w:t>
             </w:r>
           </w:p>
           <w:p>
@@ -5089,7 +5099,7 @@
             </w:pPr>
             <w:r>
               <w:rPr>
-                <w:color w:val="14453F"/>
+                <w:color w:val="5F6B64"/>
                 <w:sz w:val="18"/>
               </w:rPr>
               <w:t xml:space="preserve">• </w:t>
@@ -5098,6 +5108,7 @@
               <w:rPr>
                 <w:b w:val="0"/>
                 <w:i w:val="0"/>
+                <w:color w:val="5F6B64"/>
                 <w:sz w:val="18"/>
               </w:rPr>
               <w:t>Continue sales and V&amp;V</w:t>
@@ -5158,7 +5169,7 @@
         </w:tc>
         <w:tc>
           <w:tcPr>
-            <w:tcW w:type="dxa" w:w="2268"/>
+            <w:tcW w:type="dxa" w:w="1944"/>
             <w:tcBorders>
               <w:bottom w:val="single" w:sz="2" w:space="0" w:color="B9C4BD"/>
             </w:tcBorders>
@@ -5181,7 +5192,7 @@
         </w:tc>
         <w:tc>
           <w:tcPr>
-            <w:tcW w:type="dxa" w:w="6480"/>
+            <w:tcW w:type="dxa" w:w="6804"/>
             <w:tcBorders>
               <w:bottom w:val="single" w:sz="2" w:space="0" w:color="B9C4BD"/>
             </w:tcBorders>
@@ -5217,7 +5228,7 @@
             </w:pPr>
             <w:r>
               <w:rPr>
-                <w:color w:val="14453F"/>
+                <w:color w:val="5F6B64"/>
                 <w:sz w:val="18"/>
               </w:rPr>
               <w:t xml:space="preserve">• </w:t>
@@ -5226,6 +5237,7 @@
               <w:rPr>
                 <w:b w:val="0"/>
                 <w:i w:val="0"/>
+                <w:color w:val="5F6B64"/>
                 <w:sz w:val="18"/>
               </w:rPr>
               <w:t>Continue provider sales</w:t>
@@ -5239,7 +5251,7 @@
             </w:pPr>
             <w:r>
               <w:rPr>
-                <w:color w:val="14453F"/>
+                <w:color w:val="5F6B64"/>
                 <w:sz w:val="18"/>
               </w:rPr>
               <w:t xml:space="preserve">• </w:t>
@@ -5248,6 +5260,7 @@
               <w:rPr>
                 <w:b w:val="0"/>
                 <w:i w:val="0"/>
+                <w:color w:val="5F6B64"/>
                 <w:sz w:val="18"/>
               </w:rPr>
               <w:t>Continue the Phase IIB study</w:t>
@@ -5261,7 +5274,7 @@
             </w:pPr>
             <w:r>
               <w:rPr>
-                <w:color w:val="14453F"/>
+                <w:color w:val="5F6B64"/>
                 <w:sz w:val="18"/>
               </w:rPr>
               <w:t xml:space="preserve">• </w:t>
@@ -5270,6 +5283,7 @@
               <w:rPr>
                 <w:b w:val="0"/>
                 <w:i w:val="0"/>
+                <w:color w:val="5F6B64"/>
                 <w:sz w:val="18"/>
               </w:rPr>
               <w:t>Continue investor conversations</w:t>
@@ -5283,7 +5297,7 @@
             </w:pPr>
             <w:r>
               <w:rPr>
-                <w:color w:val="14453F"/>
+                <w:color w:val="5F6B64"/>
                 <w:sz w:val="18"/>
               </w:rPr>
               <w:t xml:space="preserve">• </w:t>
@@ -5292,6 +5306,7 @@
               <w:rPr>
                 <w:b w:val="0"/>
                 <w:i w:val="0"/>
+                <w:color w:val="5F6B64"/>
                 <w:sz w:val="18"/>
               </w:rPr>
               <w:t>Continue buyer conversations</w:t>
@@ -5352,7 +5367,7 @@
         </w:tc>
         <w:tc>
           <w:tcPr>
-            <w:tcW w:type="dxa" w:w="2268"/>
+            <w:tcW w:type="dxa" w:w="1944"/>
             <w:tcBorders>
               <w:bottom w:val="single" w:sz="2" w:space="0" w:color="B9C4BD"/>
             </w:tcBorders>
@@ -5375,7 +5390,7 @@
         </w:tc>
         <w:tc>
           <w:tcPr>
-            <w:tcW w:type="dxa" w:w="6480"/>
+            <w:tcW w:type="dxa" w:w="6804"/>
             <w:tcBorders>
               <w:bottom w:val="single" w:sz="2" w:space="0" w:color="B9C4BD"/>
             </w:tcBorders>
@@ -5400,6 +5415,29 @@
                 <w:i w:val="0"/>
                 <w:sz w:val="18"/>
               </w:rPr>
+              <w:t>Hold buyer and investor meetings against the prepared ask</w:t>
+            </w:r>
+          </w:p>
+          <w:p>
+            <w:pPr>
+              <w:spacing w:before="0" w:after="30" w:lineRule="exact" w:line="209"/>
+              <w:ind w:left="140" w:hanging="140"/>
+              <w:jc w:val="left"/>
+            </w:pPr>
+            <w:r>
+              <w:rPr>
+                <w:color w:val="5F6B64"/>
+                <w:sz w:val="18"/>
+              </w:rPr>
+              <w:t xml:space="preserve">• </w:t>
+            </w:r>
+            <w:r>
+              <w:rPr>
+                <w:b w:val="0"/>
+                <w:i w:val="0"/>
+                <w:color w:val="5F6B64"/>
+                <w:sz w:val="18"/>
+              </w:rPr>
               <w:t>Continue drafting the Research Strategy and Commercialization Plan</w:t>
             </w:r>
           </w:p>
@@ -5411,7 +5449,7 @@
             </w:pPr>
             <w:r>
               <w:rPr>
-                <w:color w:val="14453F"/>
+                <w:color w:val="5F6B64"/>
                 <w:sz w:val="18"/>
               </w:rPr>
               <w:t xml:space="preserve">• </w:t>
@@ -5420,28 +5458,7 @@
               <w:rPr>
                 <w:b w:val="0"/>
                 <w:i w:val="0"/>
-                <w:sz w:val="18"/>
-              </w:rPr>
-              <w:t>Buyer and investor meetings against the prepared ask</w:t>
-            </w:r>
-          </w:p>
-          <w:p>
-            <w:pPr>
-              <w:spacing w:before="0" w:after="30" w:lineRule="exact" w:line="209"/>
-              <w:ind w:left="140" w:hanging="140"/>
-              <w:jc w:val="left"/>
-            </w:pPr>
-            <w:r>
-              <w:rPr>
-                <w:color w:val="14453F"/>
-                <w:sz w:val="18"/>
-              </w:rPr>
-              <w:t xml:space="preserve">• </w:t>
-            </w:r>
-            <w:r>
-              <w:rPr>
-                <w:b w:val="0"/>
-                <w:i w:val="0"/>
+                <w:color w:val="5F6B64"/>
                 <w:sz w:val="18"/>
               </w:rPr>
               <w:t>Continue provider sales</w:t>
@@ -5455,7 +5472,7 @@
             </w:pPr>
             <w:r>
               <w:rPr>
-                <w:color w:val="14453F"/>
+                <w:color w:val="5F6B64"/>
                 <w:sz w:val="18"/>
               </w:rPr>
               <w:t xml:space="preserve">• </w:t>
@@ -5464,6 +5481,7 @@
               <w:rPr>
                 <w:b w:val="0"/>
                 <w:i w:val="0"/>
+                <w:color w:val="5F6B64"/>
                 <w:sz w:val="18"/>
               </w:rPr>
               <w:t>Continue the Phase IIB study</w:t>
@@ -5524,7 +5542,7 @@
         </w:tc>
         <w:tc>
           <w:tcPr>
-            <w:tcW w:type="dxa" w:w="2268"/>
+            <w:tcW w:type="dxa" w:w="1944"/>
             <w:tcBorders>
               <w:bottom w:val="single" w:sz="2" w:space="0" w:color="B9C4BD"/>
             </w:tcBorders>
@@ -5547,7 +5565,7 @@
         </w:tc>
         <w:tc>
           <w:tcPr>
-            <w:tcW w:type="dxa" w:w="6480"/>
+            <w:tcW w:type="dxa" w:w="6804"/>
             <w:tcBorders>
               <w:bottom w:val="single" w:sz="2" w:space="0" w:color="B9C4BD"/>
             </w:tcBorders>
@@ -5652,7 +5670,7 @@
         </w:tc>
         <w:tc>
           <w:tcPr>
-            <w:tcW w:type="dxa" w:w="2268"/>
+            <w:tcW w:type="dxa" w:w="1944"/>
             <w:tcBorders>
               <w:bottom w:val="single" w:sz="2" w:space="0" w:color="B9C4BD"/>
             </w:tcBorders>
@@ -5669,13 +5687,13 @@
                 <w:i w:val="0"/>
                 <w:sz w:val="18"/>
               </w:rPr>
-              <w:t>Convert HLTH; prove traction</w:t>
+              <w:t>Convert HLTH</w:t>
             </w:r>
           </w:p>
         </w:tc>
         <w:tc>
           <w:tcPr>
-            <w:tcW w:type="dxa" w:w="6480"/>
+            <w:tcW w:type="dxa" w:w="6804"/>
             <w:tcBorders>
               <w:bottom w:val="single" w:sz="2" w:space="0" w:color="B9C4BD"/>
             </w:tcBorders>
@@ -5687,28 +5705,6 @@
               <w:jc w:val="left"/>
             </w:pPr>
             <w:r/>
-            <w:r>
-              <w:rPr>
-                <w:color w:val="14453F"/>
-                <w:sz w:val="18"/>
-              </w:rPr>
-              <w:t xml:space="preserve">• </w:t>
-            </w:r>
-            <w:r>
-              <w:rPr>
-                <w:b w:val="0"/>
-                <w:i w:val="0"/>
-                <w:sz w:val="18"/>
-              </w:rPr>
-              <w:t>Continue drafting the Research Strategy and Commercialization Plan</w:t>
-            </w:r>
-          </w:p>
-          <w:p>
-            <w:pPr>
-              <w:spacing w:before="0" w:after="30" w:lineRule="exact" w:line="209"/>
-              <w:ind w:left="140" w:hanging="140"/>
-              <w:jc w:val="left"/>
-            </w:pPr>
             <w:r>
               <w:rPr>
                 <w:color w:val="14453F"/>
@@ -5799,7 +5795,7 @@
             </w:pPr>
             <w:r>
               <w:rPr>
-                <w:color w:val="14453F"/>
+                <w:color w:val="5F6B64"/>
                 <w:sz w:val="18"/>
               </w:rPr>
               <w:t xml:space="preserve">• </w:t>
@@ -5808,6 +5804,30 @@
               <w:rPr>
                 <w:b w:val="0"/>
                 <w:i w:val="0"/>
+                <w:color w:val="5F6B64"/>
+                <w:sz w:val="18"/>
+              </w:rPr>
+              <w:t>Continue drafting the Research Strategy and Commercialization Plan</w:t>
+            </w:r>
+          </w:p>
+          <w:p>
+            <w:pPr>
+              <w:spacing w:before="0" w:after="30" w:lineRule="exact" w:line="209"/>
+              <w:ind w:left="140" w:hanging="140"/>
+              <w:jc w:val="left"/>
+            </w:pPr>
+            <w:r>
+              <w:rPr>
+                <w:color w:val="5F6B64"/>
+                <w:sz w:val="18"/>
+              </w:rPr>
+              <w:t xml:space="preserve">• </w:t>
+            </w:r>
+            <w:r>
+              <w:rPr>
+                <w:b w:val="0"/>
+                <w:i w:val="0"/>
+                <w:color w:val="5F6B64"/>
                 <w:sz w:val="18"/>
               </w:rPr>
               <w:t>Continue provider sales</w:t>
@@ -5868,7 +5888,7 @@
         </w:tc>
         <w:tc>
           <w:tcPr>
-            <w:tcW w:type="dxa" w:w="2268"/>
+            <w:tcW w:type="dxa" w:w="1944"/>
             <w:tcBorders>
               <w:bottom w:val="single" w:sz="2" w:space="0" w:color="B9C4BD"/>
             </w:tcBorders>
@@ -5891,7 +5911,7 @@
         </w:tc>
         <w:tc>
           <w:tcPr>
-            <w:tcW w:type="dxa" w:w="6480"/>
+            <w:tcW w:type="dxa" w:w="6804"/>
             <w:tcBorders>
               <w:bottom w:val="single" w:sz="2" w:space="0" w:color="B9C4BD"/>
             </w:tcBorders>
@@ -5971,7 +5991,7 @@
             </w:pPr>
             <w:r>
               <w:rPr>
-                <w:color w:val="14453F"/>
+                <w:color w:val="5F6B64"/>
                 <w:sz w:val="18"/>
               </w:rPr>
               <w:t xml:space="preserve">• </w:t>
@@ -5980,6 +6000,7 @@
               <w:rPr>
                 <w:b w:val="0"/>
                 <w:i w:val="0"/>
+                <w:color w:val="5F6B64"/>
                 <w:sz w:val="18"/>
               </w:rPr>
               <w:t>Continue provider sales</w:t>
@@ -6040,7 +6061,7 @@
         </w:tc>
         <w:tc>
           <w:tcPr>
-            <w:tcW w:type="dxa" w:w="2268"/>
+            <w:tcW w:type="dxa" w:w="1944"/>
             <w:tcBorders>
               <w:bottom w:val="single" w:sz="2" w:space="0" w:color="B9C4BD"/>
             </w:tcBorders>
@@ -6063,7 +6084,7 @@
         </w:tc>
         <w:tc>
           <w:tcPr>
-            <w:tcW w:type="dxa" w:w="6480"/>
+            <w:tcW w:type="dxa" w:w="6804"/>
             <w:tcBorders>
               <w:bottom w:val="single" w:sz="2" w:space="0" w:color="B9C4BD"/>
             </w:tcBorders>
@@ -6121,7 +6142,7 @@
             </w:pPr>
             <w:r>
               <w:rPr>
-                <w:color w:val="14453F"/>
+                <w:color w:val="5F6B64"/>
                 <w:sz w:val="18"/>
               </w:rPr>
               <w:t xml:space="preserve">• </w:t>
@@ -6130,6 +6151,7 @@
               <w:rPr>
                 <w:b w:val="0"/>
                 <w:i w:val="0"/>
+                <w:color w:val="5F6B64"/>
                 <w:sz w:val="18"/>
               </w:rPr>
               <w:t>Continue provider sales</w:t>
@@ -6190,7 +6212,7 @@
         </w:tc>
         <w:tc>
           <w:tcPr>
-            <w:tcW w:type="dxa" w:w="2268"/>
+            <w:tcW w:type="dxa" w:w="1944"/>
             <w:tcBorders>
               <w:bottom w:val="single" w:sz="2" w:space="0" w:color="B9C4BD"/>
             </w:tcBorders>
@@ -6213,7 +6235,7 @@
         </w:tc>
         <w:tc>
           <w:tcPr>
-            <w:tcW w:type="dxa" w:w="6480"/>
+            <w:tcW w:type="dxa" w:w="6804"/>
             <w:tcBorders>
               <w:bottom w:val="single" w:sz="2" w:space="0" w:color="B9C4BD"/>
             </w:tcBorders>
@@ -6340,7 +6362,7 @@
         </w:tc>
         <w:tc>
           <w:tcPr>
-            <w:tcW w:type="dxa" w:w="2268"/>
+            <w:tcW w:type="dxa" w:w="1944"/>
             <w:tcBorders>
               <w:bottom w:val="single" w:sz="8" w:space="0" w:color="14453F"/>
             </w:tcBorders>
@@ -6357,13 +6379,13 @@
                 <w:i w:val="0"/>
                 <w:sz w:val="18"/>
               </w:rPr>
-              <w:t>Wrap up and submit</w:t>
+              <w:t>Submit</w:t>
             </w:r>
           </w:p>
         </w:tc>
         <w:tc>
           <w:tcPr>
-            <w:tcW w:type="dxa" w:w="6480"/>
+            <w:tcW w:type="dxa" w:w="6804"/>
             <w:tcBorders>
               <w:bottom w:val="single" w:sz="8" w:space="0" w:color="14453F"/>
             </w:tcBorders>

</xml_diff>